<commit_message>
docs(concept): add the agent-manual differentiation, fix broken tables
概念书新增「我们与用 AI 记笔记的分界」小节：
- 分界句：别人把 AI 当更强的操作者，Chordnote 把它当受约束的提议者
- 核心论点：约束写在架构里，不是写在提示词里
- 三条可验证承诺 + 各自真实状态（已实现 / 部分实现 / 规划中）
- 划清与 LLM Wiki 的边界：借鉴理念，独创的是「手册写权限边界」+「手册共用」

同时修掉一个真缺陷：pandoc 生成的表格 <w:tblGrid/> 为空、tblW 为 0%，导致
多列表格的第二列被渲染时挤没（内容还在，是布局问题）。补上 tblGrid /
tblW=100% / 逐格 tcW 后，两张两列表与一张三列表均正常显示。
</commit_message>
<xml_diff>
--- a/deliverables/Chordnote-概念书.docx
+++ b/deliverables/Chordnote-概念书.docx
@@ -285,19 +285,7 @@
         <w:t xml:space="preserve">”</w:t>
       </w:r>
       <w:r>
-        <w:t xml:space="preserve">理念。Chordnote 的 AI Agent 持有一份执行手册，规定它只能提议、不能擅改；新内容加入时，Agent 提示是否更新旧概念的上下文，实现知识</w:t>
-      </w:r>
-      <w:r>
-        <w:t xml:space="preserve">“</w:t>
-      </w:r>
-      <w:r>
-        <w:t xml:space="preserve">自愈与演进</w:t>
-      </w:r>
-      <w:r>
-        <w:t xml:space="preserve">”</w:t>
-      </w:r>
-      <w:r>
-        <w:t xml:space="preserve">。</w:t>
+        <w:t xml:space="preserve">理念。Chordnote 的 agent 持有一份执行手册，规定它只能提议、不能擅改；新内容加入时，agent 提示是否更新旧概念的上下文。</w:t>
       </w:r>
     </w:p>
     <w:p>
@@ -321,11 +309,347 @@
       <w:pPr>
         <w:pStyle w:val="Heading2"/>
       </w:pPr>
-      <w:bookmarkStart w:id="24" w:name="我们的独创规划中"/>
+      <w:bookmarkStart w:id="24" w:name="我们与用-ai-记笔记的分界agent-有工作手册不靠提示词"/>
+      <w:r>
+        <w:t xml:space="preserve">我们与</w:t>
+      </w:r>
+      <w:r>
+        <w:t xml:space="preserve">“</w:t>
+      </w:r>
+      <w:r>
+        <w:t xml:space="preserve">用 AI 记笔记</w:t>
+      </w:r>
+      <w:r>
+        <w:t xml:space="preserve">”</w:t>
+      </w:r>
+      <w:r>
+        <w:t xml:space="preserve">的分界：agent 有工作手册，不靠提示词</w:t>
+      </w:r>
+      <w:bookmarkEnd w:id="24"/>
+    </w:p>
+    <w:p>
+      <w:pPr>
+        <w:pStyle w:val="FirstParagraph"/>
+      </w:pPr>
+      <w:r>
+        <w:t xml:space="preserve">现在几乎每个笔记软件都在塞 AI。所以</w:t>
+      </w:r>
+      <w:r>
+        <w:t xml:space="preserve">“</w:t>
+      </w:r>
+      <w:r>
+        <w:t xml:space="preserve">我们有 AI 帮你整理</w:t>
+      </w:r>
+      <w:r>
+        <w:t xml:space="preserve">”</w:t>
+      </w:r>
+      <w:r>
+        <w:t xml:space="preserve">没有任何区分度。</w:t>
+      </w:r>
+    </w:p>
+    <w:p>
+      <w:pPr>
+        <w:pStyle w:val="BodyText"/>
+      </w:pPr>
+      <w:r>
+        <w:t xml:space="preserve">真正的分界在这句话上：</w:t>
+      </w:r>
+      <w:r>
+        <w:rPr>
+          <w:b/>
+        </w:rPr>
+        <w:t xml:space="preserve">别人把 AI 当成一个更强的操作者，Chordnote 把它当成一个受约束的提议者。</w:t>
+      </w:r>
+    </w:p>
+    <w:p>
+      <w:pPr>
+        <w:pStyle w:val="BodyText"/>
+      </w:pPr>
+      <w:r>
+        <w:t xml:space="preserve">落到工程上，是一句更硬的话：</w:t>
+      </w:r>
+      <w:r>
+        <w:rPr>
+          <w:b/>
+        </w:rPr>
+        <w:t xml:space="preserve">约束写在架构里，不是写在提示词里。</w:t>
+      </w:r>
+    </w:p>
+    <w:p>
+      <w:pPr>
+        <w:numPr>
+          <w:ilvl w:val="0"/>
+          <w:numId w:val="1003"/>
+        </w:numPr>
+        <w:pStyle w:val="Compact"/>
+      </w:pPr>
+      <w:r>
+        <w:t xml:space="preserve">常见的做法是</w:t>
+      </w:r>
+      <w:r>
+        <w:rPr>
+          <w:b/>
+        </w:rPr>
+        <w:t xml:space="preserve">用提示词求它乖</w:t>
+      </w:r>
+      <w:r>
+        <w:t xml:space="preserve">——</w:t>
+      </w:r>
+      <w:r>
+        <w:t xml:space="preserve">“</w:t>
+      </w:r>
+      <w:r>
+        <w:t xml:space="preserve">请不要修改原文</w:t>
+      </w:r>
+      <w:r>
+        <w:t xml:space="preserve">”</w:t>
+      </w:r>
+      <w:r>
+        <w:t xml:space="preserve">。这是祈使句，可以被绕过、被误读、被越狱。</w:t>
+      </w:r>
+    </w:p>
+    <w:p>
+      <w:pPr>
+        <w:numPr>
+          <w:ilvl w:val="0"/>
+          <w:numId w:val="1003"/>
+        </w:numPr>
+        <w:pStyle w:val="Compact"/>
+      </w:pPr>
+      <w:r>
+        <w:t xml:space="preserve">Chordnote 的做法是</w:t>
+      </w:r>
+      <w:r>
+        <w:rPr>
+          <w:b/>
+        </w:rPr>
+        <w:t xml:space="preserve">让它根本没有那个工具</w:t>
+      </w:r>
+      <w:r>
+        <w:t xml:space="preserve">。写意图只能降级为提议；越权的调用在服务层就被拒绝。</w:t>
+      </w:r>
+    </w:p>
+    <w:p>
+      <w:pPr>
+        <w:pStyle w:val="FirstParagraph"/>
+      </w:pPr>
+      <w:r>
+        <w:t xml:space="preserve">三条可验证的承诺，以及它们当前的真实状态：</w:t>
+      </w:r>
+    </w:p>
+    <w:tbl>
+      <w:tblPr>
+        <w:tblStyle w:val="Table"/>
+        <w:tblW w:type="pct" w:w="5000"/>
+        <w:tblLook w:firstRow="1"/>
+      </w:tblPr>
+      <w:tblGrid>
+        <w:gridCol w:w="2888"/>
+        <w:gridCol w:w="6137"/>
+      </w:tblGrid>
+      <w:tr>
+        <w:trPr>
+          <w:cnfStyle w:firstRow="1"/>
+        </w:trPr>
+        <w:tc>
+          <w:tcPr>
+            <w:tcW w:w="2888" w:type="dxa"/>
+            <w:tcBorders>
+              <w:bottom w:val="single"/>
+            </w:tcBorders>
+            <w:vAlign w:val="bottom"/>
+          </w:tcPr>
+          <w:p>
+            <w:pPr>
+              <w:pStyle w:val="Compact"/>
+              <w:jc w:val="left"/>
+            </w:pPr>
+            <w:r>
+              <w:t xml:space="preserve">承诺</w:t>
+            </w:r>
+          </w:p>
+        </w:tc>
+        <w:tc>
+          <w:tcPr>
+            <w:tcW w:w="6137" w:type="dxa"/>
+            <w:tcBorders>
+              <w:bottom w:val="single"/>
+            </w:tcBorders>
+            <w:vAlign w:val="bottom"/>
+          </w:tcPr>
+          <w:p>
+            <w:pPr>
+              <w:pStyle w:val="Compact"/>
+              <w:jc w:val="left"/>
+            </w:pPr>
+            <w:r>
+              <w:t xml:space="preserve">当前状态</w:t>
+            </w:r>
+          </w:p>
+        </w:tc>
+      </w:tr>
+      <w:tr>
+        <w:tc>
+          <w:tcPr>
+            <w:tcW w:w="2888" w:type="dxa"/>
+          </w:tcPr>
+          <w:p>
+            <w:pPr>
+              <w:pStyle w:val="Compact"/>
+              <w:jc w:val="left"/>
+            </w:pPr>
+            <w:r>
+              <w:t xml:space="preserve">AI 永远不能改写你的原始记录</w:t>
+            </w:r>
+          </w:p>
+        </w:tc>
+        <w:tc>
+          <w:tcPr>
+            <w:tcW w:w="6137" w:type="dxa"/>
+          </w:tcPr>
+          <w:p>
+            <w:pPr>
+              <w:pStyle w:val="Compact"/>
+              <w:jc w:val="left"/>
+            </w:pPr>
+            <w:r>
+              <w:rPr>
+                <w:b/>
+              </w:rPr>
+              <w:t xml:space="preserve">已实现</w:t>
+            </w:r>
+            <w:r>
+              <w:t xml:space="preserve">。服务层与路由层双重拒绝 agent 主体，越权调用返回 403，并强制改走提议流程</w:t>
+            </w:r>
+          </w:p>
+        </w:tc>
+      </w:tr>
+      <w:tr>
+        <w:tc>
+          <w:tcPr>
+            <w:tcW w:w="2888" w:type="dxa"/>
+          </w:tcPr>
+          <w:p>
+            <w:pPr>
+              <w:pStyle w:val="Compact"/>
+              <w:jc w:val="left"/>
+            </w:pPr>
+            <w:r>
+              <w:t xml:space="preserve">AI 不能直接在你的知识网络里建页</w:t>
+            </w:r>
+          </w:p>
+        </w:tc>
+        <w:tc>
+          <w:tcPr>
+            <w:tcW w:w="6137" w:type="dxa"/>
+          </w:tcPr>
+          <w:p>
+            <w:pPr>
+              <w:pStyle w:val="Compact"/>
+              <w:jc w:val="left"/>
+            </w:pPr>
+            <w:r>
+              <w:rPr>
+                <w:b/>
+              </w:rPr>
+              <w:t xml:space="preserve">部分实现</w:t>
+            </w:r>
+            <w:r>
+              <w:t xml:space="preserve">。提议表已建好，但写入路径尚可被绕过——正在收敛为架构级约束</w:t>
+            </w:r>
+          </w:p>
+        </w:tc>
+      </w:tr>
+      <w:tr>
+        <w:tc>
+          <w:tcPr>
+            <w:tcW w:w="2888" w:type="dxa"/>
+          </w:tcPr>
+          <w:p>
+            <w:pPr>
+              <w:pStyle w:val="Compact"/>
+              <w:jc w:val="left"/>
+            </w:pPr>
+            <w:r>
+              <w:t xml:space="preserve">所有接入的 agent 共用同一份工作手册</w:t>
+            </w:r>
+          </w:p>
+        </w:tc>
+        <w:tc>
+          <w:tcPr>
+            <w:tcW w:w="6137" w:type="dxa"/>
+          </w:tcPr>
+          <w:p>
+            <w:pPr>
+              <w:pStyle w:val="Compact"/>
+              <w:jc w:val="left"/>
+            </w:pPr>
+            <w:r>
+              <w:rPr>
+                <w:b/>
+              </w:rPr>
+              <w:t xml:space="preserve">规划中</w:t>
+            </w:r>
+            <w:r>
+              <w:t xml:space="preserve">。手册写好之后，agent 的行为由它决定，不随模型漂移</w:t>
+            </w:r>
+          </w:p>
+        </w:tc>
+      </w:tr>
+    </w:tbl>
+    <w:p>
+      <w:pPr>
+        <w:pStyle w:val="BodyText"/>
+      </w:pPr>
+      <w:r>
+        <w:rPr>
+          <w:b/>
+        </w:rPr>
+        <w:t xml:space="preserve">我们与 LLM Wiki 的诚实边界</w:t>
+      </w:r>
+      <w:r>
+        <w:t xml:space="preserve">：我们借鉴的是</w:t>
+      </w:r>
+      <w:r>
+        <w:t xml:space="preserve">“</w:t>
+      </w:r>
+      <w:r>
+        <w:t xml:space="preserve">AI 维护知识库需要一份手册</w:t>
+      </w:r>
+      <w:r>
+        <w:t xml:space="preserve">”</w:t>
+      </w:r>
+      <w:r>
+        <w:t xml:space="preserve">这个理念本身。属于我们的是——</w:t>
+      </w:r>
+      <w:r>
+        <w:rPr>
+          <w:b/>
+        </w:rPr>
+        <w:t xml:space="preserve">手册里写的不是风格指南，而是权限边界</w:t>
+      </w:r>
+      <w:r>
+        <w:t xml:space="preserve">；并且手册是</w:t>
+      </w:r>
+      <w:r>
+        <w:rPr>
+          <w:b/>
+        </w:rPr>
+        <w:t xml:space="preserve">共用的</w:t>
+      </w:r>
+      <w:r>
+        <w:t xml:space="preserve">，将来不管换哪个模型、接哪种工具，agent 的行为都由同一份手册决定。换个说法：别人的 AI 行为取决于你用了哪个模型，我们的不取决于。</w:t>
+      </w:r>
+    </w:p>
+    <w:p>
+      <w:pPr>
+        <w:pStyle w:val="Heading2"/>
+      </w:pPr>
+      <w:bookmarkStart w:id="25" w:name="我们的独创规划中"/>
       <w:r>
         <w:t xml:space="preserve">我们的独创（规划中）</w:t>
       </w:r>
-      <w:bookmarkEnd w:id="24"/>
+      <w:bookmarkEnd w:id="25"/>
     </w:p>
     <w:p>
       <w:pPr>
@@ -351,11 +675,11 @@
       <w:pPr>
         <w:pStyle w:val="Heading3"/>
       </w:pPr>
-      <w:bookmarkStart w:id="25" w:name="知识盲区地图"/>
+      <w:bookmarkStart w:id="26" w:name="知识盲区地图"/>
       <w:r>
         <w:t xml:space="preserve">① 知识盲区地图</w:t>
       </w:r>
-      <w:bookmarkEnd w:id="25"/>
+      <w:bookmarkEnd w:id="26"/>
     </w:p>
     <w:p>
       <w:pPr>
@@ -389,11 +713,11 @@
       <w:pPr>
         <w:pStyle w:val="Heading3"/>
       </w:pPr>
-      <w:bookmarkStart w:id="26" w:name="连接检验式复习"/>
+      <w:bookmarkStart w:id="27" w:name="连接检验式复习"/>
       <w:r>
         <w:t xml:space="preserve">② 连接检验式复习</w:t>
       </w:r>
-      <w:bookmarkEnd w:id="26"/>
+      <w:bookmarkEnd w:id="27"/>
     </w:p>
     <w:p>
       <w:pPr>
@@ -451,11 +775,11 @@
       <w:pPr>
         <w:pStyle w:val="Heading3"/>
       </w:pPr>
-      <w:bookmarkStart w:id="27" w:name="错题回流"/>
+      <w:bookmarkStart w:id="28" w:name="错题回流"/>
       <w:r>
         <w:t xml:space="preserve">③ 错题回流</w:t>
       </w:r>
-      <w:bookmarkEnd w:id="27"/>
+      <w:bookmarkEnd w:id="28"/>
     </w:p>
     <w:p>
       <w:pPr>
@@ -504,11 +828,11 @@
       <w:pPr>
         <w:pStyle w:val="Heading1"/>
       </w:pPr>
-      <w:bookmarkStart w:id="28" w:name="四解决方案与设计哲学"/>
+      <w:bookmarkStart w:id="29" w:name="四解决方案与设计哲学"/>
       <w:r>
         <w:t xml:space="preserve">四、解决方案与设计哲学</w:t>
       </w:r>
-      <w:bookmarkEnd w:id="28"/>
+      <w:bookmarkEnd w:id="29"/>
     </w:p>
     <w:p>
       <w:pPr>
@@ -533,17 +857,17 @@
       <w:pPr>
         <w:pStyle w:val="Heading2"/>
       </w:pPr>
-      <w:bookmarkStart w:id="29" w:name="四项设计原则"/>
+      <w:bookmarkStart w:id="30" w:name="四项设计原则"/>
       <w:r>
         <w:t xml:space="preserve">四项设计原则</w:t>
       </w:r>
-      <w:bookmarkEnd w:id="29"/>
+      <w:bookmarkEnd w:id="30"/>
     </w:p>
     <w:p>
       <w:pPr>
         <w:numPr>
           <w:ilvl w:val="0"/>
-          <w:numId w:val="1003"/>
+          <w:numId w:val="1004"/>
         </w:numPr>
       </w:pPr>
       <w:r>
@@ -572,7 +896,7 @@
       <w:pPr>
         <w:numPr>
           <w:ilvl w:val="0"/>
-          <w:numId w:val="1003"/>
+          <w:numId w:val="1004"/>
         </w:numPr>
       </w:pPr>
       <w:r>
@@ -589,7 +913,7 @@
       <w:pPr>
         <w:numPr>
           <w:ilvl w:val="0"/>
-          <w:numId w:val="1003"/>
+          <w:numId w:val="1004"/>
         </w:numPr>
       </w:pPr>
       <w:r>
@@ -606,7 +930,7 @@
       <w:pPr>
         <w:numPr>
           <w:ilvl w:val="0"/>
-          <w:numId w:val="1003"/>
+          <w:numId w:val="1004"/>
         </w:numPr>
       </w:pPr>
       <w:r>
@@ -623,11 +947,11 @@
       <w:pPr>
         <w:pStyle w:val="Heading1"/>
       </w:pPr>
-      <w:bookmarkStart w:id="30" w:name="五当前实现状态"/>
+      <w:bookmarkStart w:id="31" w:name="五当前实现状态"/>
       <w:r>
         <w:t xml:space="preserve">五、当前实现状态</w:t>
       </w:r>
-      <w:bookmarkEnd w:id="30"/>
+      <w:bookmarkEnd w:id="31"/>
     </w:p>
     <w:p>
       <w:pPr>
@@ -636,7 +960,7 @@
       <w:r>
         <w:t xml:space="preserve">演示站：</w:t>
       </w:r>
-      <w:hyperlink r:id="rId31">
+      <w:hyperlink r:id="rId32">
         <w:r>
           <w:rPr>
             <w:rStyle w:val="Hyperlink"/>
@@ -649,25 +973,29 @@
       <w:pPr>
         <w:pStyle w:val="Heading2"/>
       </w:pPr>
-      <w:bookmarkStart w:id="32" w:name="已完成"/>
+      <w:bookmarkStart w:id="33" w:name="已完成"/>
       <w:r>
         <w:t xml:space="preserve">已完成</w:t>
       </w:r>
-      <w:bookmarkEnd w:id="32"/>
+      <w:bookmarkEnd w:id="33"/>
     </w:p>
     <w:tbl>
       <w:tblPr>
         <w:tblStyle w:val="Table"/>
-        <w:tblW w:type="pct" w:w="0.0"/>
+        <w:tblW w:type="pct" w:w="5000"/>
         <w:tblLook w:firstRow="1"/>
       </w:tblPr>
-      <w:tblGrid/>
+      <w:tblGrid>
+        <w:gridCol w:w="2888"/>
+        <w:gridCol w:w="6137"/>
+      </w:tblGrid>
       <w:tr>
         <w:trPr>
           <w:cnfStyle w:firstRow="1"/>
         </w:trPr>
         <w:tc>
           <w:tcPr>
+            <w:tcW w:w="2888" w:type="dxa"/>
             <w:tcBorders>
               <w:bottom w:val="single"/>
             </w:tcBorders>
@@ -685,6 +1013,7 @@
         </w:tc>
         <w:tc>
           <w:tcPr>
+            <w:tcW w:w="6137" w:type="dxa"/>
             <w:tcBorders>
               <w:bottom w:val="single"/>
             </w:tcBorders>
@@ -703,6 +1032,9 @@
       </w:tr>
       <w:tr>
         <w:tc>
+          <w:tcPr>
+            <w:tcW w:w="2888" w:type="dxa"/>
+          </w:tcPr>
           <w:p>
             <w:pPr>
               <w:pStyle w:val="Compact"/>
@@ -714,6 +1046,9 @@
           </w:p>
         </w:tc>
         <w:tc>
+          <w:tcPr>
+            <w:tcW w:w="6137" w:type="dxa"/>
+          </w:tcPr>
           <w:p>
             <w:pPr>
               <w:pStyle w:val="Compact"/>
@@ -727,6 +1062,9 @@
       </w:tr>
       <w:tr>
         <w:tc>
+          <w:tcPr>
+            <w:tcW w:w="2888" w:type="dxa"/>
+          </w:tcPr>
           <w:p>
             <w:pPr>
               <w:pStyle w:val="Compact"/>
@@ -738,6 +1076,9 @@
           </w:p>
         </w:tc>
         <w:tc>
+          <w:tcPr>
+            <w:tcW w:w="6137" w:type="dxa"/>
+          </w:tcPr>
           <w:p>
             <w:pPr>
               <w:pStyle w:val="Compact"/>
@@ -751,6 +1092,9 @@
       </w:tr>
       <w:tr>
         <w:tc>
+          <w:tcPr>
+            <w:tcW w:w="2888" w:type="dxa"/>
+          </w:tcPr>
           <w:p>
             <w:pPr>
               <w:pStyle w:val="Compact"/>
@@ -762,6 +1106,9 @@
           </w:p>
         </w:tc>
         <w:tc>
+          <w:tcPr>
+            <w:tcW w:w="6137" w:type="dxa"/>
+          </w:tcPr>
           <w:p>
             <w:pPr>
               <w:pStyle w:val="Compact"/>
@@ -775,6 +1122,9 @@
       </w:tr>
       <w:tr>
         <w:tc>
+          <w:tcPr>
+            <w:tcW w:w="2888" w:type="dxa"/>
+          </w:tcPr>
           <w:p>
             <w:pPr>
               <w:pStyle w:val="Compact"/>
@@ -786,6 +1136,9 @@
           </w:p>
         </w:tc>
         <w:tc>
+          <w:tcPr>
+            <w:tcW w:w="6137" w:type="dxa"/>
+          </w:tcPr>
           <w:p>
             <w:pPr>
               <w:pStyle w:val="Compact"/>
@@ -799,6 +1152,9 @@
       </w:tr>
       <w:tr>
         <w:tc>
+          <w:tcPr>
+            <w:tcW w:w="2888" w:type="dxa"/>
+          </w:tcPr>
           <w:p>
             <w:pPr>
               <w:pStyle w:val="Compact"/>
@@ -810,6 +1166,9 @@
           </w:p>
         </w:tc>
         <w:tc>
+          <w:tcPr>
+            <w:tcW w:w="6137" w:type="dxa"/>
+          </w:tcPr>
           <w:p>
             <w:pPr>
               <w:pStyle w:val="Compact"/>
@@ -823,6 +1182,9 @@
       </w:tr>
       <w:tr>
         <w:tc>
+          <w:tcPr>
+            <w:tcW w:w="2888" w:type="dxa"/>
+          </w:tcPr>
           <w:p>
             <w:pPr>
               <w:pStyle w:val="Compact"/>
@@ -834,6 +1196,9 @@
           </w:p>
         </w:tc>
         <w:tc>
+          <w:tcPr>
+            <w:tcW w:w="6137" w:type="dxa"/>
+          </w:tcPr>
           <w:p>
             <w:pPr>
               <w:pStyle w:val="Compact"/>
@@ -847,6 +1212,9 @@
       </w:tr>
       <w:tr>
         <w:tc>
+          <w:tcPr>
+            <w:tcW w:w="2888" w:type="dxa"/>
+          </w:tcPr>
           <w:p>
             <w:pPr>
               <w:pStyle w:val="Compact"/>
@@ -858,6 +1226,9 @@
           </w:p>
         </w:tc>
         <w:tc>
+          <w:tcPr>
+            <w:tcW w:w="6137" w:type="dxa"/>
+          </w:tcPr>
           <w:p>
             <w:pPr>
               <w:pStyle w:val="Compact"/>
@@ -871,6 +1242,9 @@
       </w:tr>
       <w:tr>
         <w:tc>
+          <w:tcPr>
+            <w:tcW w:w="2888" w:type="dxa"/>
+          </w:tcPr>
           <w:p>
             <w:pPr>
               <w:pStyle w:val="Compact"/>
@@ -882,6 +1256,9 @@
           </w:p>
         </w:tc>
         <w:tc>
+          <w:tcPr>
+            <w:tcW w:w="6137" w:type="dxa"/>
+          </w:tcPr>
           <w:p>
             <w:pPr>
               <w:pStyle w:val="Compact"/>
@@ -895,6 +1272,42 @@
       </w:tr>
       <w:tr>
         <w:tc>
+          <w:tcPr>
+            <w:tcW w:w="2888" w:type="dxa"/>
+          </w:tcPr>
+          <w:p>
+            <w:pPr>
+              <w:pStyle w:val="Compact"/>
+              <w:jc w:val="left"/>
+            </w:pPr>
+            <w:r>
+              <w:rPr>
+                <w:b/>
+              </w:rPr>
+              <w:t xml:space="preserve">越权写入拦截</w:t>
+            </w:r>
+          </w:p>
+        </w:tc>
+        <w:tc>
+          <w:tcPr>
+            <w:tcW w:w="6137" w:type="dxa"/>
+          </w:tcPr>
+          <w:p>
+            <w:pPr>
+              <w:pStyle w:val="Compact"/>
+              <w:jc w:val="left"/>
+            </w:pPr>
+            <w:r>
+              <w:t xml:space="preserve">服务层拒绝 agent 主体改写原始记录，强制走提议流程（返回 403）</w:t>
+            </w:r>
+          </w:p>
+        </w:tc>
+      </w:tr>
+      <w:tr>
+        <w:tc>
+          <w:tcPr>
+            <w:tcW w:w="2888" w:type="dxa"/>
+          </w:tcPr>
           <w:p>
             <w:pPr>
               <w:pStyle w:val="Compact"/>
@@ -906,6 +1319,9 @@
           </w:p>
         </w:tc>
         <w:tc>
+          <w:tcPr>
+            <w:tcW w:w="6137" w:type="dxa"/>
+          </w:tcPr>
           <w:p>
             <w:pPr>
               <w:pStyle w:val="Compact"/>
@@ -922,25 +1338,29 @@
       <w:pPr>
         <w:pStyle w:val="Heading2"/>
       </w:pPr>
-      <w:bookmarkStart w:id="33" w:name="规划中尚未实现"/>
+      <w:bookmarkStart w:id="34" w:name="规划中尚未实现"/>
       <w:r>
         <w:t xml:space="preserve">规划中（尚未实现）</w:t>
       </w:r>
-      <w:bookmarkEnd w:id="33"/>
+      <w:bookmarkEnd w:id="34"/>
     </w:p>
     <w:tbl>
       <w:tblPr>
         <w:tblStyle w:val="Table"/>
-        <w:tblW w:type="pct" w:w="0.0"/>
+        <w:tblW w:type="pct" w:w="5000"/>
         <w:tblLook w:firstRow="1"/>
       </w:tblPr>
-      <w:tblGrid/>
+      <w:tblGrid>
+        <w:gridCol w:w="2888"/>
+        <w:gridCol w:w="6137"/>
+      </w:tblGrid>
       <w:tr>
         <w:trPr>
           <w:cnfStyle w:firstRow="1"/>
         </w:trPr>
         <w:tc>
           <w:tcPr>
+            <w:tcW w:w="2888" w:type="dxa"/>
             <w:tcBorders>
               <w:bottom w:val="single"/>
             </w:tcBorders>
@@ -958,6 +1378,7 @@
         </w:tc>
         <w:tc>
           <w:tcPr>
+            <w:tcW w:w="6137" w:type="dxa"/>
             <w:tcBorders>
               <w:bottom w:val="single"/>
             </w:tcBorders>
@@ -976,137 +1397,173 @@
       </w:tr>
       <w:tr>
         <w:tc>
-          <w:p>
-            <w:pPr>
-              <w:pStyle w:val="Compact"/>
-              <w:jc w:val="left"/>
-            </w:pPr>
-            <w:r>
-              <w:t xml:space="preserve">力导向知识图谱</w:t>
-            </w:r>
-          </w:p>
-        </w:tc>
-        <w:tc>
-          <w:p>
-            <w:pPr>
-              <w:pStyle w:val="Compact"/>
-              <w:jc w:val="left"/>
-            </w:pPr>
-            <w:r>
-              <w:t xml:space="preserve">前端从规则网格卡片升级为可交互的力导向图</w:t>
+          <w:tcPr>
+            <w:tcW w:w="2888" w:type="dxa"/>
+          </w:tcPr>
+          <w:p>
+            <w:pPr>
+              <w:pStyle w:val="Compact"/>
+              <w:jc w:val="left"/>
+            </w:pPr>
+            <w:r>
+              <w:t xml:space="preserve">agent 工作手册</w:t>
+            </w:r>
+          </w:p>
+        </w:tc>
+        <w:tc>
+          <w:tcPr>
+            <w:tcW w:w="6137" w:type="dxa"/>
+          </w:tcPr>
+          <w:p>
+            <w:pPr>
+              <w:pStyle w:val="Compact"/>
+              <w:jc w:val="left"/>
+            </w:pPr>
+            <w:r>
+              <w:t xml:space="preserve">所有接入的 agent 共用的规范文档，规定其权限边界与产出格式</w:t>
             </w:r>
           </w:p>
         </w:tc>
       </w:tr>
       <w:tr>
         <w:tc>
-          <w:p>
-            <w:pPr>
-              <w:pStyle w:val="Compact"/>
-              <w:jc w:val="left"/>
-            </w:pPr>
-            <w:r>
-              <w:t xml:space="preserve">反链面板</w:t>
-            </w:r>
-          </w:p>
-        </w:tc>
-        <w:tc>
-          <w:p>
-            <w:pPr>
-              <w:pStyle w:val="Compact"/>
-              <w:jc w:val="left"/>
-            </w:pPr>
-            <w:r>
-              <w:t xml:space="preserve">右栏入链/出链/未链接提及，后端接口就绪，前端界面待接</w:t>
+          <w:tcPr>
+            <w:tcW w:w="2888" w:type="dxa"/>
+          </w:tcPr>
+          <w:p>
+            <w:pPr>
+              <w:pStyle w:val="Compact"/>
+              <w:jc w:val="left"/>
+            </w:pPr>
+            <w:r>
+              <w:t xml:space="preserve">提议机制</w:t>
+            </w:r>
+          </w:p>
+        </w:tc>
+        <w:tc>
+          <w:tcPr>
+            <w:tcW w:w="6137" w:type="dxa"/>
+          </w:tcPr>
+          <w:p>
+            <w:pPr>
+              <w:pStyle w:val="Compact"/>
+              <w:jc w:val="left"/>
+            </w:pPr>
+            <w:r>
+              <w:t xml:space="preserve">提议表已建好；尚缺服务层与接口，写入边界目前仍可被绕过</w:t>
             </w:r>
           </w:p>
         </w:tc>
       </w:tr>
       <w:tr>
         <w:tc>
-          <w:p>
-            <w:pPr>
-              <w:pStyle w:val="Compact"/>
-              <w:jc w:val="left"/>
-            </w:pPr>
-            <w:r>
-              <w:t xml:space="preserve">双链语法</w:t>
-            </w:r>
-          </w:p>
-        </w:tc>
-        <w:tc>
-          <w:p>
-            <w:pPr>
-              <w:pStyle w:val="Compact"/>
-              <w:jc w:val="left"/>
-            </w:pPr>
-            <w:r>
-              <w:t xml:space="preserve">正文 [[知识页]] 自动识别并写入关系，点击可跳转</w:t>
+          <w:tcPr>
+            <w:tcW w:w="2888" w:type="dxa"/>
+          </w:tcPr>
+          <w:p>
+            <w:pPr>
+              <w:pStyle w:val="Compact"/>
+              <w:jc w:val="left"/>
+            </w:pPr>
+            <w:r>
+              <w:t xml:space="preserve">力导向知识图谱</w:t>
+            </w:r>
+          </w:p>
+        </w:tc>
+        <w:tc>
+          <w:tcPr>
+            <w:tcW w:w="6137" w:type="dxa"/>
+          </w:tcPr>
+          <w:p>
+            <w:pPr>
+              <w:pStyle w:val="Compact"/>
+              <w:jc w:val="left"/>
+            </w:pPr>
+            <w:r>
+              <w:t xml:space="preserve">前端从规则网格卡片升级为可交互的力导向图</w:t>
             </w:r>
           </w:p>
         </w:tc>
       </w:tr>
       <w:tr>
         <w:tc>
-          <w:p>
-            <w:pPr>
-              <w:pStyle w:val="Compact"/>
-              <w:jc w:val="left"/>
-            </w:pPr>
-            <w:r>
-              <w:t xml:space="preserve">错题回流</w:t>
-            </w:r>
-          </w:p>
-        </w:tc>
-        <w:tc>
-          <w:p>
-            <w:pPr>
-              <w:pStyle w:val="Compact"/>
-              <w:jc w:val="left"/>
-            </w:pPr>
-            <w:r>
-              <w:t xml:space="preserve">见第三章创意描述</w:t>
+          <w:tcPr>
+            <w:tcW w:w="2888" w:type="dxa"/>
+          </w:tcPr>
+          <w:p>
+            <w:pPr>
+              <w:pStyle w:val="Compact"/>
+              <w:jc w:val="left"/>
+            </w:pPr>
+            <w:r>
+              <w:t xml:space="preserve">反链面板</w:t>
+            </w:r>
+          </w:p>
+        </w:tc>
+        <w:tc>
+          <w:tcPr>
+            <w:tcW w:w="6137" w:type="dxa"/>
+          </w:tcPr>
+          <w:p>
+            <w:pPr>
+              <w:pStyle w:val="Compact"/>
+              <w:jc w:val="left"/>
+            </w:pPr>
+            <w:r>
+              <w:t xml:space="preserve">右栏入链/出链/未链接提及，后端接口就绪，前端界面待接</w:t>
             </w:r>
           </w:p>
         </w:tc>
       </w:tr>
       <w:tr>
         <w:tc>
-          <w:p>
-            <w:pPr>
-              <w:pStyle w:val="Compact"/>
-              <w:jc w:val="left"/>
-            </w:pPr>
-            <w:r>
-              <w:t xml:space="preserve">知识盲区地图</w:t>
-            </w:r>
-          </w:p>
-        </w:tc>
-        <w:tc>
-          <w:p>
-            <w:pPr>
-              <w:pStyle w:val="Compact"/>
-              <w:jc w:val="left"/>
-            </w:pPr>
-            <w:r>
-              <w:t xml:space="preserve">见第三章创意描述</w:t>
+          <w:tcPr>
+            <w:tcW w:w="2888" w:type="dxa"/>
+          </w:tcPr>
+          <w:p>
+            <w:pPr>
+              <w:pStyle w:val="Compact"/>
+              <w:jc w:val="left"/>
+            </w:pPr>
+            <w:r>
+              <w:t xml:space="preserve">双链语法</w:t>
+            </w:r>
+          </w:p>
+        </w:tc>
+        <w:tc>
+          <w:tcPr>
+            <w:tcW w:w="6137" w:type="dxa"/>
+          </w:tcPr>
+          <w:p>
+            <w:pPr>
+              <w:pStyle w:val="Compact"/>
+              <w:jc w:val="left"/>
+            </w:pPr>
+            <w:r>
+              <w:t xml:space="preserve">正文 [[知识页]] 自动识别并写入关系，点击可跳转</w:t>
             </w:r>
           </w:p>
         </w:tc>
       </w:tr>
       <w:tr>
         <w:tc>
-          <w:p>
-            <w:pPr>
-              <w:pStyle w:val="Compact"/>
-              <w:jc w:val="left"/>
-            </w:pPr>
-            <w:r>
-              <w:t xml:space="preserve">连接检验式复习</w:t>
-            </w:r>
-          </w:p>
-        </w:tc>
-        <w:tc>
+          <w:tcPr>
+            <w:tcW w:w="2888" w:type="dxa"/>
+          </w:tcPr>
+          <w:p>
+            <w:pPr>
+              <w:pStyle w:val="Compact"/>
+              <w:jc w:val="left"/>
+            </w:pPr>
+            <w:r>
+              <w:t xml:space="preserve">错题回流</w:t>
+            </w:r>
+          </w:p>
+        </w:tc>
+        <w:tc>
+          <w:tcPr>
+            <w:tcW w:w="6137" w:type="dxa"/>
+          </w:tcPr>
           <w:p>
             <w:pPr>
               <w:pStyle w:val="Compact"/>
@@ -1120,6 +1577,69 @@
       </w:tr>
       <w:tr>
         <w:tc>
+          <w:tcPr>
+            <w:tcW w:w="2888" w:type="dxa"/>
+          </w:tcPr>
+          <w:p>
+            <w:pPr>
+              <w:pStyle w:val="Compact"/>
+              <w:jc w:val="left"/>
+            </w:pPr>
+            <w:r>
+              <w:t xml:space="preserve">知识盲区地图</w:t>
+            </w:r>
+          </w:p>
+        </w:tc>
+        <w:tc>
+          <w:tcPr>
+            <w:tcW w:w="6137" w:type="dxa"/>
+          </w:tcPr>
+          <w:p>
+            <w:pPr>
+              <w:pStyle w:val="Compact"/>
+              <w:jc w:val="left"/>
+            </w:pPr>
+            <w:r>
+              <w:t xml:space="preserve">见第三章创意描述</w:t>
+            </w:r>
+          </w:p>
+        </w:tc>
+      </w:tr>
+      <w:tr>
+        <w:tc>
+          <w:tcPr>
+            <w:tcW w:w="2888" w:type="dxa"/>
+          </w:tcPr>
+          <w:p>
+            <w:pPr>
+              <w:pStyle w:val="Compact"/>
+              <w:jc w:val="left"/>
+            </w:pPr>
+            <w:r>
+              <w:t xml:space="preserve">连接检验式复习</w:t>
+            </w:r>
+          </w:p>
+        </w:tc>
+        <w:tc>
+          <w:tcPr>
+            <w:tcW w:w="6137" w:type="dxa"/>
+          </w:tcPr>
+          <w:p>
+            <w:pPr>
+              <w:pStyle w:val="Compact"/>
+              <w:jc w:val="left"/>
+            </w:pPr>
+            <w:r>
+              <w:t xml:space="preserve">见第三章创意描述</w:t>
+            </w:r>
+          </w:p>
+        </w:tc>
+      </w:tr>
+      <w:tr>
+        <w:tc>
+          <w:tcPr>
+            <w:tcW w:w="2888" w:type="dxa"/>
+          </w:tcPr>
           <w:p>
             <w:pPr>
               <w:pStyle w:val="Compact"/>
@@ -1131,6 +1651,9 @@
           </w:p>
         </w:tc>
         <w:tc>
+          <w:tcPr>
+            <w:tcW w:w="6137" w:type="dxa"/>
+          </w:tcPr>
           <w:p>
             <w:pPr>
               <w:pStyle w:val="Compact"/>
@@ -1147,11 +1670,11 @@
       <w:pPr>
         <w:pStyle w:val="Heading1"/>
       </w:pPr>
-      <w:bookmarkStart w:id="34" w:name="六mvp1.0规划"/>
+      <w:bookmarkStart w:id="35" w:name="六mvp1.0规划"/>
       <w:r>
         <w:t xml:space="preserve">六、MVP（1.0）规划</w:t>
       </w:r>
-      <w:bookmarkEnd w:id="34"/>
+      <w:bookmarkEnd w:id="35"/>
     </w:p>
     <w:p>
       <w:pPr>
@@ -1164,16 +1687,21 @@
     <w:tbl>
       <w:tblPr>
         <w:tblStyle w:val="Table"/>
-        <w:tblW w:type="pct" w:w="0.0"/>
+        <w:tblW w:type="pct" w:w="5000"/>
         <w:tblLook w:firstRow="1"/>
       </w:tblPr>
-      <w:tblGrid/>
+      <w:tblGrid>
+        <w:gridCol w:w="1985"/>
+        <w:gridCol w:w="3520"/>
+        <w:gridCol w:w="3520"/>
+      </w:tblGrid>
       <w:tr>
         <w:trPr>
           <w:cnfStyle w:firstRow="1"/>
         </w:trPr>
         <w:tc>
           <w:tcPr>
+            <w:tcW w:w="1985" w:type="dxa"/>
             <w:tcBorders>
               <w:bottom w:val="single"/>
             </w:tcBorders>
@@ -1191,6 +1719,7 @@
         </w:tc>
         <w:tc>
           <w:tcPr>
+            <w:tcW w:w="3520" w:type="dxa"/>
             <w:tcBorders>
               <w:bottom w:val="single"/>
             </w:tcBorders>
@@ -1208,6 +1737,7 @@
         </w:tc>
         <w:tc>
           <w:tcPr>
+            <w:tcW w:w="3520" w:type="dxa"/>
             <w:tcBorders>
               <w:bottom w:val="single"/>
             </w:tcBorders>
@@ -1226,6 +1756,9 @@
       </w:tr>
       <w:tr>
         <w:tc>
+          <w:tcPr>
+            <w:tcW w:w="1985" w:type="dxa"/>
+          </w:tcPr>
           <w:p>
             <w:pPr>
               <w:pStyle w:val="Compact"/>
@@ -1237,6 +1770,9 @@
           </w:p>
         </w:tc>
         <w:tc>
+          <w:tcPr>
+            <w:tcW w:w="3520" w:type="dxa"/>
+          </w:tcPr>
           <w:p>
             <w:pPr>
               <w:pStyle w:val="Compact"/>
@@ -1248,6 +1784,9 @@
           </w:p>
         </w:tc>
         <w:tc>
+          <w:tcPr>
+            <w:tcW w:w="3520" w:type="dxa"/>
+          </w:tcPr>
           <w:p>
             <w:pPr>
               <w:pStyle w:val="Compact"/>
@@ -1273,6 +1812,9 @@
       </w:tr>
       <w:tr>
         <w:tc>
+          <w:tcPr>
+            <w:tcW w:w="1985" w:type="dxa"/>
+          </w:tcPr>
           <w:p>
             <w:pPr>
               <w:pStyle w:val="Compact"/>
@@ -1284,6 +1826,9 @@
           </w:p>
         </w:tc>
         <w:tc>
+          <w:tcPr>
+            <w:tcW w:w="3520" w:type="dxa"/>
+          </w:tcPr>
           <w:p>
             <w:pPr>
               <w:pStyle w:val="Compact"/>
@@ -1295,6 +1840,9 @@
           </w:p>
         </w:tc>
         <w:tc>
+          <w:tcPr>
+            <w:tcW w:w="3520" w:type="dxa"/>
+          </w:tcPr>
           <w:p>
             <w:pPr>
               <w:pStyle w:val="Compact"/>
@@ -1332,6 +1880,9 @@
       </w:tr>
       <w:tr>
         <w:tc>
+          <w:tcPr>
+            <w:tcW w:w="1985" w:type="dxa"/>
+          </w:tcPr>
           <w:p>
             <w:pPr>
               <w:pStyle w:val="Compact"/>
@@ -1343,6 +1894,9 @@
           </w:p>
         </w:tc>
         <w:tc>
+          <w:tcPr>
+            <w:tcW w:w="3520" w:type="dxa"/>
+          </w:tcPr>
           <w:p>
             <w:pPr>
               <w:pStyle w:val="Compact"/>
@@ -1354,6 +1908,9 @@
           </w:p>
         </w:tc>
         <w:tc>
+          <w:tcPr>
+            <w:tcW w:w="3520" w:type="dxa"/>
+          </w:tcPr>
           <w:p>
             <w:pPr>
               <w:pStyle w:val="Compact"/>
@@ -1674,6 +2231,9 @@
     <w:abstractNumId w:val="991"/>
   </w:num>
   <w:num w:numId="1003">
+    <w:abstractNumId w:val="991"/>
+  </w:num>
+  <w:num w:numId="1004">
     <w:abstractNumId w:val="991"/>
   </w:num>
 </w:numbering>

</xml_diff>